<commit_message>
feat: implementar arquitectura mvc estricta
</commit_message>
<xml_diff>
--- a/docs/word/01_Entregable_1_Informe_Inicial.docx
+++ b/docs/word/01_Entregable_1_Informe_Inicial.docx
@@ -595,7 +595,7 @@
     </w:p>
     <w:p>
       <w:r>
-        <w:t>La primera entrega define el problema, el contexto, los objetivos, la justificación, los beneficiarios, el alcance y la viabilidad. El producto se plantea como un MVP demostrable, escalable hacia SQL Server, integración con Watson Assistant y despliegue institucional.</w:t>
+        <w:t>La primera entrega define el problema, el contexto, los objetivos, la justificación, los beneficiarios, el alcance y la viabilidad. El producto se plantea como un MVP demostrable con arquitectura MVC estricta, SQL Server local, integración futura con Watson Assistant y despliegue institucional.</w:t>
       </w:r>
     </w:p>
     <w:p>
@@ -1011,7 +1011,7 @@
                 <w:color w:val="222222"/>
                 <w:sz w:val="18"/>
               </w:rPr>
-              <w:t>Se propone una interfaz responsiva y una base preparada para SQL Server.</w:t>
+              <w:t>Se propone una interfaz responsiva con backend MVC y SQL Server LocalDB.</w:t>
             </w:r>
           </w:p>
         </w:tc>
@@ -2771,7 +2771,7 @@
                 <w:color w:val="222222"/>
                 <w:sz w:val="18"/>
               </w:rPr>
-              <w:t>Exportar respaldos CSV y preparar persistencia SQL Server.</w:t>
+              <w:t>Usar SQL Server en modo MVC y exportar respaldos CSV del modo demo.</w:t>
             </w:r>
           </w:p>
         </w:tc>
@@ -3299,7 +3299,7 @@
     <w:p/>
     <w:p>
       <w:r>
-        <w:t>Viabilidad: la propuesta es técnica y económicamente viable como MVP, porque utiliza una interfaz web y puede operar con datos de demostración. Para una puesta en producción se deberá incorporar backend, base de datos SQL Server, autenticación, copias de seguridad y pruebas de aceptación con usuarios.</w:t>
+        <w:t>Viabilidad: la propuesta es técnica y económicamente viable como MVP, porque utiliza una interfaz web y cuenta con un backend MVC conectado a SQL Server LocalDB. Para una puesta en producción se deberán incorporar autenticación, copias de seguridad, auditoría y pruebas de aceptación con usuarios.</w:t>
       </w:r>
     </w:p>
     <w:p>

</xml_diff>